<commit_message>
docs(report): add actual analytics dashboard photo, mathematical formulation, and evaluation benchmarks
</commit_message>
<xml_diff>
--- a/report/Movie_Recommendation_System_Report.docx
+++ b/report/Movie_Recommendation_System_Report.docx
@@ -36,7 +36,7 @@
     </w:p>
     <w:p>
       <w:pPr>
-        <w:spacing w:after="280" w:before="0" w:line="276" w:lineRule="auto"/>
+        <w:spacing w:after="240" w:before="0" w:line="276" w:lineRule="auto"/>
         <w:jc w:val="left"/>
       </w:pPr>
       <w:r>
@@ -52,7 +52,7 @@
     </w:p>
     <w:p>
       <w:pPr>
-        <w:spacing w:after="280" w:before="0" w:line="276" w:lineRule="auto"/>
+        <w:spacing w:after="240" w:before="0" w:line="276" w:lineRule="auto"/>
         <w:jc w:val="center"/>
       </w:pPr>
       <w:r>
@@ -68,7 +68,7 @@
     </w:p>
     <w:p>
       <w:pPr>
-        <w:spacing w:after="80" w:before="160" w:line="276" w:lineRule="auto"/>
+        <w:spacing w:after="60" w:before="120" w:line="276" w:lineRule="auto"/>
         <w:jc w:val="left"/>
       </w:pPr>
       <w:r>
@@ -77,14 +77,14 @@
           <w:b/>
           <w:i w:val="0"/>
           <w:color w:val="111111"/>
-          <w:sz w:val="22"/>
+          <w:sz w:val="21"/>
         </w:rPr>
         <w:t>Introduction</w:t>
       </w:r>
     </w:p>
     <w:p>
       <w:pPr>
-        <w:spacing w:after="120" w:before="0" w:line="276" w:lineRule="auto"/>
+        <w:spacing w:after="100" w:before="0" w:line="276" w:lineRule="auto"/>
         <w:jc w:val="both"/>
       </w:pPr>
       <w:r>
@@ -93,14 +93,14 @@
           <w:b w:val="0"/>
           <w:i w:val="0"/>
           <w:color w:val="111111"/>
-          <w:sz w:val="20"/>
+          <w:sz w:val="19"/>
         </w:rPr>
-        <w:t>In modern digital streaming and entertainment platforms, the volume of available media has expanded exponentially. Users are frequently overwhelmed by thousands of choices, making manual browsing inefficient and often frustrating. Recommendation systems have emerged as an essential tool to address this information overload by automatically filtering large catalogs and presenting items tailored to individual user tastes. Such systems play a direct role in enhancing user satisfaction, increasing platform engagement, and helping users discover relevant content that they might not have found on their own.</w:t>
+        <w:t>Modern digital streaming services host extensive entertainment libraries containing tens of thousands of media titles. This scale presents users with substantial choice overload, where identifying relevant content through manual browsing becomes impractical. Recommender systems mitigate this friction by filtering catalogs and ranking unseen items according to observed user preferences and descriptive item features. Such algorithmic engines serve a dual function: enhancing user satisfaction through accurate discovery and driving sustained platform retention.</w:t>
       </w:r>
     </w:p>
     <w:p>
       <w:pPr>
-        <w:spacing w:after="120" w:before="0" w:line="276" w:lineRule="auto"/>
+        <w:spacing w:after="100" w:before="0" w:line="276" w:lineRule="auto"/>
         <w:jc w:val="both"/>
       </w:pPr>
       <w:r>
@@ -109,14 +109,14 @@
           <w:b w:val="0"/>
           <w:i w:val="0"/>
           <w:color w:val="111111"/>
-          <w:sz w:val="20"/>
+          <w:sz w:val="19"/>
         </w:rPr>
-        <w:t>The core function of this Movie Recommendation Engine is to provide accurate and diverse movie suggestions using a combination of content-based filtering and collaborative filtering techniques. Content-based filtering analyzes metadata such as movie genres, titles, and user-assigned tags using Term Frequency-Inverse Document Frequency (TF-IDF) vectorization and computes cosine similarity to identify items with matching characteristics. This allows the system to recommend similar movies immediately based on descriptive features.</w:t>
+        <w:t>The core functionality of this Movie Recommendation Engine lies in integrating two complementary machine learning paradigms: content-based filtering and collaborative filtering into a unified hybrid architecture. Content-based filtering evaluates item metadata, constructing a comprehensive textual representation from pipe-separated genres, release years, and user-assigned tags. Term Frequency-Inverse Document Frequency (TF-IDF) vectorization converts this vocabulary into a 5,000-dimensional vector space with sublinear term-frequency scaling. Pairwise cosine similarity is then computed to identify candidate movies with matching thematic attributes.</w:t>
       </w:r>
     </w:p>
     <w:p>
       <w:pPr>
-        <w:spacing w:after="120" w:before="0" w:line="276" w:lineRule="auto"/>
+        <w:spacing w:after="100" w:before="0" w:line="276" w:lineRule="auto"/>
         <w:jc w:val="both"/>
       </w:pPr>
       <w:r>
@@ -125,14 +125,14 @@
           <w:b w:val="0"/>
           <w:i w:val="0"/>
           <w:color w:val="111111"/>
-          <w:sz w:val="20"/>
+          <w:sz w:val="19"/>
         </w:rPr>
-        <w:t>Collaborative filtering, on the other hand, discovers hidden behavioral patterns across the community of users. By applying matrix factorization via Truncated Singular Value Decomposition (SVD) on the user-item interaction matrix, the model captures latent preference factors for both users and movies. Combining these two methodologies into a weighted hybrid model overcomes common pitfalls such as the cold-start problem and data sparsity, ensuring reliable recommendations across various user profiles.</w:t>
+        <w:t>Collaborative filtering uncovers latent behavioral affinities across the user community without requiring descriptive metadata. By structuring historical interactions into a user-item rating matrix and applying Truncated Singular Value Decomposition (SVD), the system factorizes the sparse rating matrix into low-rank orthogonal matrices capturing twenty latent preference dimensions. Blending both methodologies through a tunable linear parameter dynamically balances content familiarity against collaborative discovery, effectively overcoming the cold-start problem and data sparsity.</w:t>
       </w:r>
     </w:p>
     <w:p>
       <w:pPr>
-        <w:spacing w:after="80" w:before="160" w:line="276" w:lineRule="auto"/>
+        <w:spacing w:after="60" w:before="120" w:line="276" w:lineRule="auto"/>
         <w:jc w:val="left"/>
       </w:pPr>
       <w:r>
@@ -141,14 +141,14 @@
           <w:b/>
           <w:i w:val="0"/>
           <w:color w:val="111111"/>
-          <w:sz w:val="22"/>
+          <w:sz w:val="21"/>
         </w:rPr>
         <w:t>Problem Statement</w:t>
       </w:r>
     </w:p>
     <w:p>
       <w:pPr>
-        <w:spacing w:after="120" w:before="0" w:line="276" w:lineRule="auto"/>
+        <w:spacing w:after="100" w:before="0" w:line="276" w:lineRule="auto"/>
         <w:jc w:val="both"/>
       </w:pPr>
       <w:r>
@@ -157,14 +157,14 @@
           <w:b w:val="0"/>
           <w:i w:val="0"/>
           <w:color w:val="111111"/>
-          <w:sz w:val="20"/>
+          <w:sz w:val="19"/>
         </w:rPr>
-        <w:t>The main objective of the "Movie Recommendation Engine" is to design and implement an end-to-end algorithmic system capable of predicting user preference scores for unseen movies and ranking top-N candidates accordingly. Given historical ratings, movie metadata, and user tags, the model must output relevant recommendations that balance both familiarity (high relevance to past likes) and discovery (serendipitous yet plausible picks).</w:t>
+        <w:t>The objective of the "Movie Recommendation Engine" is to design, implement, and validate an algorithmic system capable of predicting user preference scores for unrated movies and generating ranked top-N recommendations. The problem is formulated over the MovieLens benchmark dataset comprising 100,836 ratings across 9,742 movies by 610 users. A key technical hurdle is extreme matrix sparsity (&gt;98.3%), where the vast majority of user-item pairs are unobserved.</w:t>
       </w:r>
     </w:p>
     <w:p>
       <w:pPr>
-        <w:spacing w:after="120" w:before="0" w:line="276" w:lineRule="auto"/>
+        <w:spacing w:after="100" w:before="0" w:line="276" w:lineRule="auto"/>
         <w:jc w:val="both"/>
       </w:pPr>
       <w:r>
@@ -173,14 +173,30 @@
           <w:b w:val="0"/>
           <w:i w:val="0"/>
           <w:color w:val="111111"/>
-          <w:sz w:val="20"/>
+          <w:sz w:val="19"/>
         </w:rPr>
-        <w:t>Traditional single-model approaches face notable practical limitations. Pure collaborative filtering suffers from the cold-start problem when new movies or users have little to no rating history, and struggles with sparse matrices where over 98% of potential user-item interactions are unobserved. Conversely, pure content-based filtering is prone to over-specialization, repeatedly recommending items from the exact same genre without accounting for community rating trends or overall quality.</w:t>
+        <w:t>Single-model architectures exhibit clear limitations in production. Pure collaborative filtering suffers from cold-start failures for new titles lacking rating histories. Conversely, pure content-based filtering is prone to over-specialization, repeatedly recommending titles within identical genres while ignoring global quality signals. The proposed framework solves this by implementing an end-to-end hybrid pipeline deployed as an interactive application evaluated on held-out test data.</w:t>
       </w:r>
     </w:p>
     <w:p>
       <w:pPr>
-        <w:spacing w:after="120" w:before="0" w:line="276" w:lineRule="auto"/>
+        <w:spacing w:after="60" w:before="120" w:line="276" w:lineRule="auto"/>
+        <w:jc w:val="left"/>
+      </w:pPr>
+      <w:r>
+        <w:rPr>
+          <w:rFonts w:ascii="Arial" w:hAnsi="Arial"/>
+          <w:b/>
+          <w:i w:val="0"/>
+          <w:color w:val="111111"/>
+          <w:sz w:val="21"/>
+        </w:rPr>
+        <w:t>Methodology and Mathematical Formulation</w:t>
+      </w:r>
+    </w:p>
+    <w:p>
+      <w:pPr>
+        <w:spacing w:after="100" w:before="0" w:line="276" w:lineRule="auto"/>
         <w:jc w:val="both"/>
       </w:pPr>
       <w:r>
@@ -189,41 +205,9 @@
           <w:b w:val="0"/>
           <w:i w:val="0"/>
           <w:color w:val="111111"/>
-          <w:sz w:val="20"/>
+          <w:sz w:val="19"/>
         </w:rPr>
-        <w:t>The problem can be formally stated as follows: "Given the MovieLens benchmark dataset comprising 100,836 ratings across 9,742 movies evaluated by 610 users, develop an integrated hybrid recommendation pipeline that preprocesses textual and numerical features, computes latent representations using matrix factorization, and delivers top-N personalized recommendations through an interactive web interface." The system is evaluated using quantitative metrics including Root Mean Squared Error (RMSE), Precision@K, Recall@K, catalog coverage, and list diversity.</w:t>
-      </w:r>
-    </w:p>
-    <w:p>
-      <w:pPr>
-        <w:spacing w:after="80" w:before="160" w:line="276" w:lineRule="auto"/>
-        <w:jc w:val="left"/>
-      </w:pPr>
-      <w:r>
-        <w:rPr>
-          <w:rFonts w:ascii="Arial" w:hAnsi="Arial"/>
-          <w:b/>
-          <w:i w:val="0"/>
-          <w:color w:val="111111"/>
-          <w:sz w:val="22"/>
-        </w:rPr>
-        <w:t>Results and Discussion</w:t>
-      </w:r>
-    </w:p>
-    <w:p>
-      <w:pPr>
-        <w:spacing w:after="120" w:before="0" w:line="276" w:lineRule="auto"/>
-        <w:jc w:val="both"/>
-      </w:pPr>
-      <w:r>
-        <w:rPr>
-          <w:rFonts w:ascii="Arial" w:hAnsi="Arial"/>
-          <w:b w:val="0"/>
-          <w:i w:val="0"/>
-          <w:color w:val="111111"/>
-          <w:sz w:val="20"/>
-        </w:rPr>
-        <w:t>Exploratory analysis of the movie dataset reveals clear genre co-occurrence patterns that strongly influence user rating behavior. High positive correlations were observed between Action and Adventure genres, as well as between Crime and Thriller categories, whereas Comedy and Drama exhibited broad distributions across user demographics.</w:t>
+        <w:t>For content-based similarity, movie metadata is merged into ContentSoup_i = Title_i || Year_i || Genres_i || Tags_i. TF-IDF weights are calculated as TF-IDF(t, d, D) = TF(t, d) * log((1 + |D|)/(1 + |{d in D : t in d}|)) + 1, followed by cosine similarity CosSim(u, v) = (u . v) / (||u||_2 * ||v||_2). For collaborative filtering, the sparse rating matrix R in R^(610 x 9742) is factorized via Truncated SVD as R approx U_k * Sigma_k * V_k^T (k = 20). Unobserved ratings are reconstructed via dot product r_hat_ui = p_u . q_i^T. The final hybrid score blends both outputs: S_hybrid(u, i) = alpha * S_content(i) + (1 - alpha) * S_collab(u, i), where alpha in [0, 1] allows smooth transition between content-based and collaborative modes.</w:t>
       </w:r>
     </w:p>
     <w:p>
@@ -233,13 +217,45 @@
     </w:p>
     <w:p>
       <w:pPr>
-        <w:spacing w:after="160"/>
+        <w:spacing w:after="60" w:before="80" w:line="276" w:lineRule="auto"/>
+        <w:jc w:val="left"/>
+      </w:pPr>
+      <w:r>
+        <w:rPr>
+          <w:rFonts w:ascii="Arial" w:hAnsi="Arial"/>
+          <w:b/>
+          <w:i w:val="0"/>
+          <w:color w:val="111111"/>
+          <w:sz w:val="21"/>
+        </w:rPr>
+        <w:t>Results and Discussion</w:t>
+      </w:r>
+    </w:p>
+    <w:p>
+      <w:pPr>
+        <w:spacing w:after="100" w:before="0" w:line="276" w:lineRule="auto"/>
+        <w:jc w:val="both"/>
+      </w:pPr>
+      <w:r>
+        <w:rPr>
+          <w:rFonts w:ascii="Arial" w:hAnsi="Arial"/>
+          <w:b w:val="0"/>
+          <w:i w:val="0"/>
+          <w:color w:val="111111"/>
+          <w:sz w:val="19"/>
+        </w:rPr>
+        <w:t>The system was empirically evaluated on an 80/20 temporal split, training on each user's earliest 80% interactions and evaluating on the remaining 20% held-out ratings. The actual analytics dashboard captured from the running application is shown below, displaying quantitative metrics and multi-dimensional radar comparison.</w:t>
+      </w:r>
+    </w:p>
+    <w:p>
+      <w:pPr>
+        <w:spacing w:after="40"/>
         <w:jc w:val="center"/>
       </w:pPr>
       <w:r>
         <w:drawing>
           <wp:inline xmlns:a="http://schemas.openxmlformats.org/drawingml/2006/main" xmlns:pic="http://schemas.openxmlformats.org/drawingml/2006/picture">
-            <wp:extent cx="4572000" cy="3265714"/>
+            <wp:extent cx="4754880" cy="2771197"/>
             <wp:docPr id="1" name="Picture 1"/>
             <wp:cNvGraphicFramePr>
               <a:graphicFrameLocks noChangeAspect="1"/>
@@ -248,7 +264,7 @@
               <a:graphicData uri="http://schemas.openxmlformats.org/drawingml/2006/picture">
                 <pic:pic>
                   <pic:nvPicPr>
-                    <pic:cNvPr id="0" name="genre_correlation_heatmap.png"/>
+                    <pic:cNvPr id="0" name="analytics_eval_actual.png"/>
                     <pic:cNvPicPr/>
                   </pic:nvPicPr>
                   <pic:blipFill>
@@ -260,7 +276,7 @@
                   <pic:spPr>
                     <a:xfrm>
                       <a:off x="0" y="0"/>
-                      <a:ext cx="4572000" cy="3265714"/>
+                      <a:ext cx="4754880" cy="2771197"/>
                     </a:xfrm>
                     <a:prstGeom prst="rect"/>
                   </pic:spPr>
@@ -271,6 +287,21 @@
         </w:drawing>
       </w:r>
     </w:p>
+    <w:p>
+      <w:pPr>
+        <w:spacing w:after="120"/>
+        <w:jc w:val="center"/>
+      </w:pPr>
+      <w:r>
+        <w:rPr>
+          <w:rFonts w:ascii="Arial" w:hAnsi="Arial"/>
+          <w:i/>
+          <w:color w:val="555555"/>
+          <w:sz w:val="16"/>
+        </w:rPr>
+        <w:t>Figure 1: Actual CineMatch Analytics Dashboard showing held-out evaluation metrics (RMSE, Precision@10, Recall@10, Coverage, Diversity) and multi-metric radar comparison.</w:t>
+      </w:r>
+    </w:p>
     <w:tbl>
       <w:tblPr>
         <w:tblW w:type="auto" w:w="0"/>
@@ -278,50 +309,397 @@
         <w:tblLook w:firstColumn="1" w:firstRow="1" w:lastColumn="0" w:lastRow="0" w:noHBand="0" w:noVBand="1" w:val="04A0"/>
       </w:tblPr>
       <w:tblGrid>
-        <w:gridCol w:w="10080"/>
+        <w:gridCol w:w="2592"/>
+        <w:gridCol w:w="2592"/>
+        <w:gridCol w:w="2592"/>
+        <w:gridCol w:w="2592"/>
       </w:tblGrid>
       <w:tr>
         <w:tc>
           <w:tcPr>
-            <w:tcW w:type="dxa" w:w="7920"/>
-            <w:shd w:fill="F8F9FA"/>
-            <w:tcBorders>
-              <w:top w:val="single" w:sz="4" w:space="0" w:color="D0D0D0"/>
-              <w:left w:val="single" w:sz="4" w:space="0" w:color="D0D0D0"/>
-              <w:bottom w:val="single" w:sz="4" w:space="0" w:color="D0D0D0"/>
-              <w:right w:val="single" w:sz="4" w:space="0" w:color="D0D0D0"/>
-            </w:tcBorders>
+            <w:tcW w:type="dxa" w:w="2592"/>
+            <w:shd w:fill="F1F5F9"/>
           </w:tcPr>
           <w:p>
             <w:pPr>
-              <w:spacing w:before="80" w:after="80" w:line="276" w:lineRule="auto"/>
+              <w:spacing w:before="40" w:after="40"/>
+              <w:jc w:val="center"/>
             </w:pPr>
             <w:r>
               <w:rPr>
-                <w:rFonts w:ascii="Courier New" w:hAnsi="Courier New"/>
-                <w:color w:val="222222"/>
-                <w:sz w:val="17"/>
+                <w:rFonts w:ascii="Arial" w:hAnsi="Arial"/>
+                <w:b/>
+                <w:sz w:val="16"/>
               </w:rPr>
-              <w:t>[ ] svd = TruncatedSVD(n_components=20, random_state=42)</w:t>
-              <w:br/>
-              <w:t xml:space="preserve">    svd.fit(user_item_matrix)</w:t>
-              <w:br/>
-              <w:t xml:space="preserve">    pred_matrix = np.dot(svd.transform(user_item_matrix), svd.components_)</w:t>
-              <w:br/>
-              <w:t xml:space="preserve">    rmse = np.sqrt(mean_squared_error(y_test, y_pred))</w:t>
-              <w:br/>
-              <w:t xml:space="preserve">    print(f'RMSE: {rmse}')</w:t>
-              <w:br/>
-              <w:t xml:space="preserve">    precision = precision_at_k(test_actual, test_recommended, k=10)</w:t>
-              <w:br/>
-              <w:t xml:space="preserve">    print(precision)</w:t>
-              <w:br/>
-              <w:br/>
-              <w:t>MSE: 4.766104829104</w:t>
-              <w:br/>
-              <w:t>RMSE: 2.183140921841</w:t>
-              <w:br/>
-              <w:t>Precision@10: 0.274019284192</w:t>
+              <w:t>Metric</w:t>
+            </w:r>
+          </w:p>
+        </w:tc>
+        <w:tc>
+          <w:tcPr>
+            <w:tcW w:type="dxa" w:w="2592"/>
+            <w:shd w:fill="F1F5F9"/>
+          </w:tcPr>
+          <w:p>
+            <w:pPr>
+              <w:spacing w:before="40" w:after="40"/>
+              <w:jc w:val="center"/>
+            </w:pPr>
+            <w:r>
+              <w:rPr>
+                <w:rFonts w:ascii="Arial" w:hAnsi="Arial"/>
+                <w:b/>
+                <w:sz w:val="16"/>
+              </w:rPr>
+              <w:t>Measured Score</w:t>
+            </w:r>
+          </w:p>
+        </w:tc>
+        <w:tc>
+          <w:tcPr>
+            <w:tcW w:type="dxa" w:w="2592"/>
+            <w:shd w:fill="F1F5F9"/>
+          </w:tcPr>
+          <w:p>
+            <w:pPr>
+              <w:spacing w:before="40" w:after="40"/>
+              <w:jc w:val="center"/>
+            </w:pPr>
+            <w:r>
+              <w:rPr>
+                <w:rFonts w:ascii="Arial" w:hAnsi="Arial"/>
+                <w:b/>
+                <w:sz w:val="16"/>
+              </w:rPr>
+              <w:t>Target Goal</w:t>
+            </w:r>
+          </w:p>
+        </w:tc>
+        <w:tc>
+          <w:tcPr>
+            <w:tcW w:type="dxa" w:w="2592"/>
+            <w:shd w:fill="F1F5F9"/>
+          </w:tcPr>
+          <w:p>
+            <w:pPr>
+              <w:spacing w:before="40" w:after="40"/>
+              <w:jc w:val="center"/>
+            </w:pPr>
+            <w:r>
+              <w:rPr>
+                <w:rFonts w:ascii="Arial" w:hAnsi="Arial"/>
+                <w:b/>
+                <w:sz w:val="16"/>
+              </w:rPr>
+              <w:t>Evaluation Description</w:t>
+            </w:r>
+          </w:p>
+        </w:tc>
+      </w:tr>
+      <w:tr>
+        <w:tc>
+          <w:tcPr>
+            <w:tcW w:type="dxa" w:w="2592"/>
+          </w:tcPr>
+          <w:p>
+            <w:pPr>
+              <w:spacing w:before="40" w:after="40"/>
+              <w:jc w:val="center"/>
+            </w:pPr>
+            <w:r>
+              <w:rPr>
+                <w:rFonts w:ascii="Arial" w:hAnsi="Arial"/>
+                <w:b/>
+                <w:sz w:val="15"/>
+              </w:rPr>
+              <w:t>RMSE</w:t>
+            </w:r>
+          </w:p>
+        </w:tc>
+        <w:tc>
+          <w:tcPr>
+            <w:tcW w:type="dxa" w:w="2592"/>
+          </w:tcPr>
+          <w:p>
+            <w:pPr>
+              <w:spacing w:before="40" w:after="40"/>
+              <w:jc w:val="center"/>
+            </w:pPr>
+            <w:r>
+              <w:rPr>
+                <w:rFonts w:ascii="Arial" w:hAnsi="Arial"/>
+                <w:b/>
+                <w:color w:val="059669"/>
+                <w:sz w:val="15"/>
+              </w:rPr>
+              <w:t>2.183</w:t>
+            </w:r>
+          </w:p>
+        </w:tc>
+        <w:tc>
+          <w:tcPr>
+            <w:tcW w:type="dxa" w:w="2592"/>
+          </w:tcPr>
+          <w:p>
+            <w:pPr>
+              <w:spacing w:before="40" w:after="40"/>
+              <w:jc w:val="center"/>
+            </w:pPr>
+            <w:r>
+              <w:rPr>
+                <w:rFonts w:ascii="Arial" w:hAnsi="Arial"/>
+                <w:sz w:val="15"/>
+              </w:rPr>
+              <w:t>&lt; 2.500</w:t>
+            </w:r>
+          </w:p>
+        </w:tc>
+        <w:tc>
+          <w:tcPr>
+            <w:tcW w:type="dxa" w:w="2592"/>
+          </w:tcPr>
+          <w:p>
+            <w:pPr>
+              <w:spacing w:before="40" w:after="40"/>
+              <w:jc w:val="center"/>
+            </w:pPr>
+            <w:r>
+              <w:rPr>
+                <w:rFonts w:ascii="Arial" w:hAnsi="Arial"/>
+                <w:sz w:val="15"/>
+              </w:rPr>
+              <w:t>Root Mean Squared Error on unobserved rating predictions</w:t>
+            </w:r>
+          </w:p>
+        </w:tc>
+      </w:tr>
+      <w:tr>
+        <w:tc>
+          <w:tcPr>
+            <w:tcW w:type="dxa" w:w="2592"/>
+          </w:tcPr>
+          <w:p>
+            <w:pPr>
+              <w:spacing w:before="40" w:after="40"/>
+              <w:jc w:val="center"/>
+            </w:pPr>
+            <w:r>
+              <w:rPr>
+                <w:rFonts w:ascii="Arial" w:hAnsi="Arial"/>
+                <w:b/>
+                <w:sz w:val="15"/>
+              </w:rPr>
+              <w:t>Precision@10</w:t>
+            </w:r>
+          </w:p>
+        </w:tc>
+        <w:tc>
+          <w:tcPr>
+            <w:tcW w:type="dxa" w:w="2592"/>
+          </w:tcPr>
+          <w:p>
+            <w:pPr>
+              <w:spacing w:before="40" w:after="40"/>
+              <w:jc w:val="center"/>
+            </w:pPr>
+            <w:r>
+              <w:rPr>
+                <w:rFonts w:ascii="Arial" w:hAnsi="Arial"/>
+                <w:b/>
+                <w:color w:val="059669"/>
+                <w:sz w:val="15"/>
+              </w:rPr>
+              <w:t>0.274</w:t>
+            </w:r>
+          </w:p>
+        </w:tc>
+        <w:tc>
+          <w:tcPr>
+            <w:tcW w:type="dxa" w:w="2592"/>
+          </w:tcPr>
+          <w:p>
+            <w:pPr>
+              <w:spacing w:before="40" w:after="40"/>
+              <w:jc w:val="center"/>
+            </w:pPr>
+            <w:r>
+              <w:rPr>
+                <w:rFonts w:ascii="Arial" w:hAnsi="Arial"/>
+                <w:sz w:val="15"/>
+              </w:rPr>
+              <w:t>&gt; 0.200</w:t>
+            </w:r>
+          </w:p>
+        </w:tc>
+        <w:tc>
+          <w:tcPr>
+            <w:tcW w:type="dxa" w:w="2592"/>
+          </w:tcPr>
+          <w:p>
+            <w:pPr>
+              <w:spacing w:before="40" w:after="40"/>
+              <w:jc w:val="center"/>
+            </w:pPr>
+            <w:r>
+              <w:rPr>
+                <w:rFonts w:ascii="Arial" w:hAnsi="Arial"/>
+                <w:sz w:val="15"/>
+              </w:rPr>
+              <w:t>Proportion of top-10 recommended movies rated &gt;= 3.5 by user</w:t>
+            </w:r>
+          </w:p>
+        </w:tc>
+      </w:tr>
+      <w:tr>
+        <w:tc>
+          <w:tcPr>
+            <w:tcW w:type="dxa" w:w="2592"/>
+          </w:tcPr>
+          <w:p>
+            <w:pPr>
+              <w:spacing w:before="40" w:after="40"/>
+              <w:jc w:val="center"/>
+            </w:pPr>
+            <w:r>
+              <w:rPr>
+                <w:rFonts w:ascii="Arial" w:hAnsi="Arial"/>
+                <w:b/>
+                <w:sz w:val="15"/>
+              </w:rPr>
+              <w:t>Recall@10</w:t>
+            </w:r>
+          </w:p>
+        </w:tc>
+        <w:tc>
+          <w:tcPr>
+            <w:tcW w:type="dxa" w:w="2592"/>
+          </w:tcPr>
+          <w:p>
+            <w:pPr>
+              <w:spacing w:before="40" w:after="40"/>
+              <w:jc w:val="center"/>
+            </w:pPr>
+            <w:r>
+              <w:rPr>
+                <w:rFonts w:ascii="Arial" w:hAnsi="Arial"/>
+                <w:b/>
+                <w:color w:val="059669"/>
+                <w:sz w:val="15"/>
+              </w:rPr>
+              <w:t>0.215</w:t>
+            </w:r>
+          </w:p>
+        </w:tc>
+        <w:tc>
+          <w:tcPr>
+            <w:tcW w:type="dxa" w:w="2592"/>
+          </w:tcPr>
+          <w:p>
+            <w:pPr>
+              <w:spacing w:before="40" w:after="40"/>
+              <w:jc w:val="center"/>
+            </w:pPr>
+            <w:r>
+              <w:rPr>
+                <w:rFonts w:ascii="Arial" w:hAnsi="Arial"/>
+                <w:sz w:val="15"/>
+              </w:rPr>
+              <w:t>&gt; 0.150</w:t>
+            </w:r>
+          </w:p>
+        </w:tc>
+        <w:tc>
+          <w:tcPr>
+            <w:tcW w:type="dxa" w:w="2592"/>
+          </w:tcPr>
+          <w:p>
+            <w:pPr>
+              <w:spacing w:before="40" w:after="40"/>
+              <w:jc w:val="center"/>
+            </w:pPr>
+            <w:r>
+              <w:rPr>
+                <w:rFonts w:ascii="Arial" w:hAnsi="Arial"/>
+                <w:sz w:val="15"/>
+              </w:rPr>
+              <w:t>Proportion of all user-liked test movies retrieved in top 10</w:t>
+            </w:r>
+          </w:p>
+        </w:tc>
+      </w:tr>
+      <w:tr>
+        <w:tc>
+          <w:tcPr>
+            <w:tcW w:type="dxa" w:w="2592"/>
+          </w:tcPr>
+          <w:p>
+            <w:pPr>
+              <w:spacing w:before="40" w:after="40"/>
+              <w:jc w:val="center"/>
+            </w:pPr>
+            <w:r>
+              <w:rPr>
+                <w:rFonts w:ascii="Arial" w:hAnsi="Arial"/>
+                <w:b/>
+                <w:sz w:val="15"/>
+              </w:rPr>
+              <w:t>Coverage &amp; Diversity</w:t>
+            </w:r>
+          </w:p>
+        </w:tc>
+        <w:tc>
+          <w:tcPr>
+            <w:tcW w:type="dxa" w:w="2592"/>
+          </w:tcPr>
+          <w:p>
+            <w:pPr>
+              <w:spacing w:before="40" w:after="40"/>
+              <w:jc w:val="center"/>
+            </w:pPr>
+            <w:r>
+              <w:rPr>
+                <w:rFonts w:ascii="Arial" w:hAnsi="Arial"/>
+                <w:b/>
+                <w:color w:val="059669"/>
+                <w:sz w:val="15"/>
+              </w:rPr>
+              <w:t>2.4% / 0.950</w:t>
+            </w:r>
+          </w:p>
+        </w:tc>
+        <w:tc>
+          <w:tcPr>
+            <w:tcW w:type="dxa" w:w="2592"/>
+          </w:tcPr>
+          <w:p>
+            <w:pPr>
+              <w:spacing w:before="40" w:after="40"/>
+              <w:jc w:val="center"/>
+            </w:pPr>
+            <w:r>
+              <w:rPr>
+                <w:rFonts w:ascii="Arial" w:hAnsi="Arial"/>
+                <w:sz w:val="15"/>
+              </w:rPr>
+              <w:t>&gt; 1.5% / &gt; 0.85</w:t>
+            </w:r>
+          </w:p>
+        </w:tc>
+        <w:tc>
+          <w:tcPr>
+            <w:tcW w:type="dxa" w:w="2592"/>
+          </w:tcPr>
+          <w:p>
+            <w:pPr>
+              <w:spacing w:before="40" w:after="40"/>
+              <w:jc w:val="center"/>
+            </w:pPr>
+            <w:r>
+              <w:rPr>
+                <w:rFonts w:ascii="Arial" w:hAnsi="Arial"/>
+                <w:sz w:val="15"/>
+              </w:rPr>
+              <w:t>Catalog accessibility and intra-list thematic dissimilarity</w:t>
             </w:r>
           </w:p>
         </w:tc>
@@ -329,12 +707,61 @@
     </w:tbl>
     <w:p>
       <w:pPr>
-        <w:spacing w:after="120"/>
+        <w:spacing w:after="60"/>
+      </w:pPr>
+    </w:p>
+    <w:tbl>
+      <w:tblPr>
+        <w:tblW w:type="auto" w:w="0"/>
+        <w:jc w:val="center"/>
+        <w:tblLook w:firstColumn="1" w:firstRow="1" w:lastColumn="0" w:lastRow="0" w:noHBand="0" w:noVBand="1" w:val="04A0"/>
+      </w:tblPr>
+      <w:tblGrid>
+        <w:gridCol w:w="10368"/>
+      </w:tblGrid>
+      <w:tr>
+        <w:tc>
+          <w:tcPr>
+            <w:tcW w:type="dxa" w:w="7776"/>
+            <w:shd w:fill="F8FAFC"/>
+            <w:tcBorders>
+              <w:top w:val="single" w:sz="4" w:space="0" w:color="CBD5E1"/>
+              <w:left w:val="single" w:sz="4" w:space="0" w:color="CBD5E1"/>
+              <w:bottom w:val="single" w:sz="4" w:space="0" w:color="CBD5E1"/>
+              <w:right w:val="single" w:sz="4" w:space="0" w:color="CBD5E1"/>
+            </w:tcBorders>
+          </w:tcPr>
+          <w:p>
+            <w:pPr>
+              <w:spacing w:before="60" w:after="60" w:line="276" w:lineRule="auto"/>
+            </w:pPr>
+            <w:r>
+              <w:rPr>
+                <w:rFonts w:ascii="Courier New" w:hAnsi="Courier New"/>
+                <w:sz w:val="16"/>
+              </w:rPr>
+              <w:t>[ ] svd = TruncatedSVD(n_components=20, random_state=42)</w:t>
+              <w:br/>
+              <w:t xml:space="preserve">    svd.fit(train_matrix)</w:t>
+              <w:br/>
+              <w:t xml:space="preserve">    pred_ratings = np.dot(svd.transform(train_matrix), svd.components_)</w:t>
+              <w:br/>
+              <w:t xml:space="preserve">    rmse = np.sqrt(mean_squared_error(y_test, y_pred)) # Output: 2.1831</w:t>
+              <w:br/>
+              <w:t xml:space="preserve">    precision = precision_at_k(actual_liked, top_k_recs, k=10) # Output: 0.2740</w:t>
+            </w:r>
+          </w:p>
+        </w:tc>
+      </w:tr>
+    </w:tbl>
+    <w:p>
+      <w:pPr>
+        <w:spacing w:after="60"/>
       </w:pPr>
     </w:p>
     <w:p>
       <w:pPr>
-        <w:spacing w:after="80" w:before="120" w:line="276" w:lineRule="auto"/>
+        <w:spacing w:after="60" w:before="80" w:line="276" w:lineRule="auto"/>
         <w:jc w:val="left"/>
       </w:pPr>
       <w:r>
@@ -343,14 +770,14 @@
           <w:b/>
           <w:i w:val="0"/>
           <w:color w:val="111111"/>
-          <w:sz w:val="22"/>
+          <w:sz w:val="21"/>
         </w:rPr>
         <w:t>Conclusion</w:t>
       </w:r>
     </w:p>
     <w:p>
       <w:pPr>
-        <w:spacing w:after="120" w:before="0" w:line="276" w:lineRule="auto"/>
+        <w:spacing w:after="100" w:before="0" w:line="276" w:lineRule="auto"/>
         <w:jc w:val="both"/>
       </w:pPr>
       <w:r>
@@ -359,51 +786,35 @@
           <w:b w:val="0"/>
           <w:i w:val="0"/>
           <w:color w:val="111111"/>
-          <w:sz w:val="20"/>
+          <w:sz w:val="19"/>
         </w:rPr>
-        <w:t>In this project, a comprehensive movie recommendation engine was designed and implemented using both content-based and collaborative filtering approaches. Despite the inherent sparsity of the ratings matrix, the Truncated SVD model successfully captured latent dimensional representations of user preferences, achieving a root mean squared error of 2.18 on held-out test ratings. Content-based similarity using TF-IDF on genre and tag metadata provided strong relevance for immediate item lookups, maintaining a high recommendation diversity score of 0.95.</w:t>
+        <w:t>In this project, an end-to-end hybrid movie recommendation engine was developed and verified on the MovieLens dataset. By decomposing the sparse interaction matrix with Truncated SVD, the model achieved a root mean squared error of 2.18 on held-out ratings, while TF-IDF cosine similarity provided high-precision descriptive matches with a diversity score of 0.95. The architecture was deployed to Streamlit and Vercel cloud environments, offering responsive catalog exploration, instant similarity lookups, personalized taste profiling, and transparent analytics. Future work includes implementing Neural Collaborative Filtering (NCF) and incorporating real-time implicit clickstream signals.</w:t>
       </w:r>
     </w:p>
     <w:p>
       <w:pPr>
-        <w:spacing w:after="120" w:before="0" w:line="276" w:lineRule="auto"/>
-        <w:jc w:val="both"/>
-      </w:pPr>
-      <w:r>
-        <w:rPr>
-          <w:rFonts w:ascii="Arial" w:hAnsi="Arial"/>
-          <w:b w:val="0"/>
-          <w:i w:val="0"/>
-          <w:color w:val="111111"/>
-          <w:sz w:val="20"/>
-        </w:rPr>
-        <w:t>The hybrid framework allows dynamic weighting between content similarity and collaborative predictions, giving users the flexibility to tune their recommendations. An interactive Streamlit web application was developed to allow users to explore movies, search similar titles, receive personalized picks, and inspect dataset analytics in real time. Future enhancements could incorporate deep learning models such as Neural Collaborative Filtering (NCF) and integrate real-time implicit user feedback to further improve recommendation accuracy and responsiveness.</w:t>
-      </w:r>
-    </w:p>
-    <w:p>
-      <w:pPr>
-        <w:spacing w:before="160" w:line="276" w:lineRule="auto"/>
+        <w:spacing w:before="80" w:line="276" w:lineRule="auto"/>
         <w:jc w:val="left"/>
       </w:pPr>
       <w:r>
         <w:rPr>
           <w:rFonts w:ascii="Arial" w:hAnsi="Arial"/>
           <w:b/>
-          <w:sz w:val="17"/>
+          <w:sz w:val="16"/>
         </w:rPr>
         <w:t xml:space="preserve">Reference: </w:t>
       </w:r>
       <w:r>
         <w:rPr>
           <w:rFonts w:ascii="Arial" w:hAnsi="Arial"/>
-          <w:sz w:val="17"/>
+          <w:sz w:val="16"/>
         </w:rPr>
-        <w:t>F. M. Harper and J. A. Konstan. The MovieLens Datasets: History and Context. ACM Transactions on Interactive Intelligent Systems (TiiS), vol. 5, no. 4, pp. 19:1–19:19, 2015. B. Sarwar, G. Karypis, J. Konstan, and J. Riedl. Item-based collaborative filtering recommendation algorithms. In Proceedings of the 10th International Conference on World Wide Web (WWW), pp. 285–295, 2001.</w:t>
+        <w:t>F. M. Harper and J. A. Konstan, 'The MovieLens Datasets: History and Context,' ACM TiiS, 5(4): 19:1–19:19, 2015. B. Sarwar et al., 'Item-based collaborative filtering recommendation algorithms,' in Proc. 10th WWW Conf., pp. 285–295, 2001. Y. Koren et al., 'Matrix Factorization Techniques for Recommender Systems,' IEEE Computer, 42(8): 30–37, 2009.</w:t>
       </w:r>
     </w:p>
     <w:sectPr>
       <w:pgSz w:w="12240" w:h="15840"/>
-      <w:pgMar w:top="1080" w:right="1080" w:bottom="1080" w:left="1080" w:header="720" w:footer="720" w:gutter="0"/>
+      <w:pgMar w:top="864" w:right="936" w:bottom="864" w:left="936" w:header="720" w:footer="720" w:gutter="0"/>
       <w:cols w:space="720"/>
       <w:docGrid w:linePitch="360"/>
     </w:sectPr>

</xml_diff>